<commit_message>
Work-order header: sample WordArt title, 12pt office block, one-page fit
- Transplant the stretched outlined WordArt title ("CYBERABAD MUNICIPAL
  CORPORATION", Impact/blue with text outline) from the reference document,
  anchored with both logos (reusing existing rId5/rId6 media) so it matches
  the sample header and no longer renders as small plain text.
- Set the office-address block ("Office of the … CMC, Telangana.") to 12pt.
- Keep the work order to strictly one page by reducing the bottom margin
  from 1in to 0.5in; verified a full-length work name + address still fits.

The WordArt keeps its VML fallback, so the document still opens in Word 2007.

Co-Authored-By: Claude Opus 4.8 <noreply@anthropic.com>
</commit_message>
<xml_diff>
--- a/resources/work-order-template.docx
+++ b/resources/work-order-template.docx
@@ -37,13 +37,215 @@
             <w:pPr>
               <w:spacing w:after="0" w:line="240" w:lineRule="auto"/>
               <w:jc w:val="center"/>
+              <w:rPr>
+                <w:rFonts w:ascii="Times New Roman" w:eastAsia="Calibri" w:hAnsi="Times New Roman" w:cs="Times New Roman"/>
+                <w:kern w:val="0"/>
+                <w:sz w:val="20"/>
+                <w:szCs w:val="22"/>
+                <w:lang w:val="en-US"/>
+                <w14:ligatures w14:val="none"/>
+              </w:rPr>
             </w:pPr>
             <w:r>
+              <w:rPr>
+                <w:rFonts w:ascii="Times New Roman" w:eastAsia="Calibri" w:hAnsi="Times New Roman" w:cs="Times New Roman"/>
+                <w:noProof/>
+                <w:kern w:val="0"/>
+                <w:sz w:val="22"/>
+                <w:szCs w:val="22"/>
+                <w14:ligatures w14:val="none"/>
+              </w:rPr>
+              <mc:AlternateContent>
+                <mc:Choice Requires="wps">
+                  <w:drawing>
+                    <wp:anchor distT="0" distB="0" distL="114300" distR="114300" simplePos="0" relativeHeight="251659264" behindDoc="1" locked="0" layoutInCell="1" allowOverlap="1" wp14:anchorId="43152ACF" wp14:editId="1E180E62">
+                      <wp:simplePos x="0" y="0"/>
+                      <wp:positionH relativeFrom="column">
+                        <wp:posOffset>585470</wp:posOffset>
+                      </wp:positionH>
+                      <wp:positionV relativeFrom="paragraph">
+                        <wp:posOffset>86995</wp:posOffset>
+                      </wp:positionV>
+                      <wp:extent cx="4874260" cy="564515"/>
+                      <wp:effectExtent l="0" t="0" r="0" b="0"/>
+                      <wp:wrapNone/>
+                      <wp:docPr id="1366719364" name="WordArt 39"/>
+                      <wp:cNvGraphicFramePr>
+                        <a:graphicFrameLocks xmlns:a="http://schemas.openxmlformats.org/drawingml/2006/main"/>
+                      </wp:cNvGraphicFramePr>
+                      <a:graphic xmlns:a="http://schemas.openxmlformats.org/drawingml/2006/main">
+                        <a:graphicData uri="http://schemas.microsoft.com/office/word/2010/wordprocessingShape">
+                          <wps:wsp>
+                            <wps:cNvSpPr txBox="1">
+                              <a:spLocks/>
+                            </wps:cNvSpPr>
+                            <wps:spPr bwMode="auto">
+                              <a:xfrm>
+                                <a:off x="0" y="0"/>
+                                <a:ext cx="4874260" cy="564515"/>
+                              </a:xfrm>
+                              <a:prstGeom prst="rect">
+                                <a:avLst/>
+                              </a:prstGeom>
+                              <a:extLst>
+                                <a:ext uri="{AF507438-7753-43E0-B8FC-AC1667EBCBE1}">
+                                  <a14:hiddenEffects xmlns:a14="http://schemas.microsoft.com/office/drawing/2010/main">
+                                    <a:effectLst/>
+                                  </a14:hiddenEffects>
+                                </a:ext>
+                              </a:extLst>
+                            </wps:spPr>
+                            <wps:txbx>
+                              <w:txbxContent>
+                                <w:p>
+                                  <w:pPr>
+                                    <w:jc w:val="center"/>
+                                    <w:rPr>
+                                      <w:rFonts w:ascii="Impact" w:hAnsi="Impact"/>
+                                      <w:color w:val="001DAC"/>
+                                      <w:kern w:val="0"/>
+                                      <w:sz w:val="37"/>
+                                      <w:szCs w:val="37"/>
+                                      <w:lang w:val="en-GB"/>
+                                      <w14:textOutline w14:w="9525" w14:cap="flat" w14:cmpd="sng" w14:algn="ctr">
+                                        <w14:solidFill>
+                                          <w14:srgbClr w14:val="000000">
+                                            <w14:lumMod w14:val="100000"/>
+                                            <w14:lumOff w14:val="0"/>
+                                          </w14:srgbClr>
+                                        </w14:solidFill>
+                                        <w14:prstDash w14:val="solid"/>
+                                        <w14:round/>
+                                      </w14:textOutline>
+                                      <w14:ligatures w14:val="none"/>
+                                    </w:rPr>
+                                  </w:pPr>
+                                  <w:r>
+                                    <w:rPr>
+                                      <w:rFonts w:ascii="Impact" w:hAnsi="Impact"/>
+                                      <w:color w:val="001DAC"/>
+                                      <w:sz w:val="37"/>
+                                      <w:szCs w:val="37"/>
+                                      <w:lang w:val="en-GB"/>
+                                      <w14:textOutline w14:w="9525" w14:cap="flat" w14:cmpd="sng" w14:algn="ctr">
+                                        <w14:solidFill>
+                                          <w14:srgbClr w14:val="000000">
+                                            <w14:lumMod w14:val="100000"/>
+                                            <w14:lumOff w14:val="0"/>
+                                          </w14:srgbClr>
+                                        </w14:solidFill>
+                                        <w14:prstDash w14:val="solid"/>
+                                        <w14:round/>
+                                      </w14:textOutline>
+                                    </w:rPr>
+                                    <w:t>CYBERABAD MUNICIPAL CORPORATION</w:t>
+                                  </w:r>
+                                </w:p>
+                              </w:txbxContent>
+                            </wps:txbx>
+                            <wps:bodyPr wrap="square" lIns="0" tIns="0" rIns="0" bIns="0" numCol="1" fromWordArt="1">
+                              <a:prstTxWarp prst="textPlain">
+                                <a:avLst>
+                                  <a:gd name="adj" fmla="val 50000"/>
+                                </a:avLst>
+                              </a:prstTxWarp>
+                              <a:noAutofit/>
+                            </wps:bodyPr>
+                          </wps:wsp>
+                        </a:graphicData>
+                      </a:graphic>
+                      <wp14:sizeRelH relativeFrom="page">
+                        <wp14:pctWidth>0</wp14:pctWidth>
+                      </wp14:sizeRelH>
+                      <wp14:sizeRelV relativeFrom="page">
+                        <wp14:pctHeight>0</wp14:pctHeight>
+                      </wp14:sizeRelV>
+                    </wp:anchor>
+                  </w:drawing>
+                </mc:Choice>
+                <mc:Fallback>
+                  <w:pict>
+                    <v:shapetype w14:anchorId="43152ACF" id="_x0000_t202" coordsize="21600,21600" o:spt="202" path="m,l,21600r21600,l21600,xe">
+                      <v:stroke joinstyle="miter"/>
+                      <v:path gradientshapeok="t" o:connecttype="rect"/>
+                    </v:shapetype>
+                    <v:shape id="WordArt 39" o:spid="_x0000_s1026" type="#_x0000_t202" style="position:absolute;left:0;text-align:left;margin-left:46.1pt;margin-top:6.85pt;width:383.8pt;height:44.45pt;z-index:-251657216;visibility:visible;mso-wrap-style:square;mso-width-percent:0;mso-height-percent:0;mso-wrap-distance-left:9pt;mso-wrap-distance-top:0;mso-wrap-distance-right:9pt;mso-wrap-distance-bottom:0;mso-position-horizontal:absolute;mso-position-horizontal-relative:text;mso-position-vertical:absolute;mso-position-vertical-relative:text;mso-width-percent:0;mso-height-percent:0;mso-width-relative:page;mso-height-relative:page;v-text-anchor:top" o:gfxdata="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" filled="f" stroked="f">
+                      <v:textbox inset="0,0,0,0">
+                        <w:txbxContent>
+                          <w:p>
+                            <w:pPr>
+                              <w:jc w:val="center"/>
+                              <w:rPr>
+                                <w:rFonts w:ascii="Impact" w:hAnsi="Impact"/>
+                                <w:color w:val="001DAC"/>
+                                <w:kern w:val="0"/>
+                                <w:sz w:val="37"/>
+                                <w:szCs w:val="37"/>
+                                <w:lang w:val="en-GB"/>
+                                <w14:textOutline w14:w="9525" w14:cap="flat" w14:cmpd="sng" w14:algn="ctr">
+                                  <w14:solidFill>
+                                    <w14:srgbClr w14:val="000000">
+                                      <w14:lumMod w14:val="100000"/>
+                                      <w14:lumOff w14:val="0"/>
+                                    </w14:srgbClr>
+                                  </w14:solidFill>
+                                  <w14:prstDash w14:val="solid"/>
+                                  <w14:round/>
+                                </w14:textOutline>
+                                <w14:ligatures w14:val="none"/>
+                              </w:rPr>
+                            </w:pPr>
+                            <w:r>
+                              <w:rPr>
+                                <w:rFonts w:ascii="Impact" w:hAnsi="Impact"/>
+                                <w:color w:val="001DAC"/>
+                                <w:sz w:val="37"/>
+                                <w:szCs w:val="37"/>
+                                <w:lang w:val="en-GB"/>
+                                <w14:textOutline w14:w="9525" w14:cap="flat" w14:cmpd="sng" w14:algn="ctr">
+                                  <w14:solidFill>
+                                    <w14:srgbClr w14:val="000000">
+                                      <w14:lumMod w14:val="100000"/>
+                                      <w14:lumOff w14:val="0"/>
+                                    </w14:srgbClr>
+                                  </w14:solidFill>
+                                  <w14:prstDash w14:val="solid"/>
+                                  <w14:round/>
+                                </w14:textOutline>
+                              </w:rPr>
+                              <w:t>CYBERABAD MUNICIPAL CORPORATION</w:t>
+                            </w:r>
+                          </w:p>
+                        </w:txbxContent>
+                      </v:textbox>
+                    </v:shape>
+                  </w:pict>
+                </mc:Fallback>
+              </mc:AlternateContent>
+            </w:r>
+            <w:r>
+              <w:rPr>
+                <w:rFonts w:ascii="Times New Roman" w:eastAsia="Calibri" w:hAnsi="Times New Roman" w:cs="Times New Roman"/>
+                <w:noProof/>
+                <w:kern w:val="0"/>
+                <w:sz w:val="22"/>
+                <w:szCs w:val="22"/>
+                <w:lang w:val="en-US" w:bidi="te-IN"/>
+                <w14:ligatures w14:val="none"/>
+              </w:rPr>
               <w:drawing>
-                <wp:inline xmlns:wp="http://schemas.openxmlformats.org/drawingml/2006/wordprocessingDrawing" distT="0" distB="0" distL="0" distR="0">
+                <wp:anchor distT="0" distB="0" distL="114300" distR="114300" simplePos="0" relativeHeight="251660288" behindDoc="1" locked="0" layoutInCell="1" allowOverlap="1" wp14:anchorId="1BEC8E82" wp14:editId="5D23E0F3">
+                  <wp:simplePos x="0" y="0"/>
+                  <wp:positionH relativeFrom="column">
+                    <wp:posOffset>-52512</wp:posOffset>
+                  </wp:positionH>
+                  <wp:positionV relativeFrom="paragraph">
+                    <wp:posOffset>97624</wp:posOffset>
+                  </wp:positionV>
                   <wp:extent cx="561395" cy="572494"/>
-                  <wp:effectExtent l="0" t="0" r="0" b="0"/>
-                  <wp:docPr id="101" name="Emblem"/>
+                  <wp:effectExtent l="19050" t="0" r="0" b="0"/>
+                  <wp:wrapNone/>
+                  <wp:docPr id="34" name="Picture 10" descr="C:\Users\Administrator\Downloads\telanganalogo1.png"/>
                   <wp:cNvGraphicFramePr>
                     <a:graphicFrameLocks xmlns:a="http://schemas.openxmlformats.org/drawingml/2006/main" noChangeAspect="1"/>
                   </wp:cNvGraphicFramePr>
@@ -51,16 +253,19 @@
                     <a:graphicData uri="http://schemas.openxmlformats.org/drawingml/2006/picture">
                       <pic:pic xmlns:pic="http://schemas.openxmlformats.org/drawingml/2006/picture">
                         <pic:nvPicPr>
-                          <pic:cNvPr id="101" name="Emblem"/>
-                          <pic:cNvPicPr/>
+                          <pic:cNvPr id="0" name="Picture 10" descr="C:\Users\Administrator\Downloads\telanganalogo1.png"/>
+                          <pic:cNvPicPr>
+                            <a:picLocks noChangeAspect="1" noChangeArrowheads="1"/>
+                          </pic:cNvPicPr>
                         </pic:nvPicPr>
                         <pic:blipFill>
-                          <a:blip r:embed="rId5"/>
+                          <a:blip r:embed="rId5" cstate="print"/>
+                          <a:srcRect/>
                           <a:stretch>
                             <a:fillRect/>
                           </a:stretch>
                         </pic:blipFill>
-                        <pic:spPr>
+                        <pic:spPr bwMode="auto">
                           <a:xfrm>
                             <a:off x="0" y="0"/>
                             <a:ext cx="561395" cy="572494"/>
@@ -68,53 +273,43 @@
                           <a:prstGeom prst="rect">
                             <a:avLst/>
                           </a:prstGeom>
+                          <a:noFill/>
+                          <a:ln w="9525">
+                            <a:noFill/>
+                            <a:miter lim="800000"/>
+                            <a:headEnd/>
+                            <a:tailEnd/>
+                          </a:ln>
                         </pic:spPr>
                       </pic:pic>
                     </a:graphicData>
                   </a:graphic>
-                </wp:inline>
+                </wp:anchor>
               </w:drawing>
             </w:r>
-          </w:p>
-        </w:tc>
-        <w:tc>
-          <w:tcPr>
-            <w:tcW w:w="6316" w:type="dxa"/>
-            <w:vAlign w:val="center"/>
-          </w:tcPr>
-          <w:p>
-            <w:pPr>
-              <w:spacing w:after="0" w:line="240" w:lineRule="auto"/>
-              <w:jc w:val="center"/>
-            </w:pPr>
             <w:r>
               <w:rPr>
-                <w:rFonts w:ascii="Impact" w:hAnsi="Impact"/>
-                <w:color w:val="001DAC"/>
-                <w:sz w:val="37"/>
-                <w:szCs w:val="37"/>
-                <w:lang w:val="en-GB"/>
+                <w:rFonts w:ascii="Times New Roman" w:eastAsia="Calibri" w:hAnsi="Times New Roman" w:cs="Times New Roman"/>
+                <w:noProof/>
+                <w:kern w:val="0"/>
+                <w:sz w:val="22"/>
+                <w:szCs w:val="22"/>
+                <w:lang w:val="en-US" w:bidi="te-IN"/>
+                <w14:ligatures w14:val="none"/>
               </w:rPr>
-              <w:t>CYBERABAD MUNICIPAL CORPORATION</w:t>
-            </w:r>
-          </w:p>
-        </w:tc>
-        <w:tc>
-          <w:tcPr>
-            <w:tcW w:w="1350" w:type="dxa"/>
-            <w:vAlign w:val="center"/>
-          </w:tcPr>
-          <w:p>
-            <w:pPr>
-              <w:spacing w:after="0" w:line="240" w:lineRule="auto"/>
-              <w:jc w:val="center"/>
-            </w:pPr>
-            <w:r>
               <w:drawing>
-                <wp:inline xmlns:wp="http://schemas.openxmlformats.org/drawingml/2006/wordprocessingDrawing" distT="0" distB="0" distL="0" distR="0">
+                <wp:anchor distT="0" distB="0" distL="114300" distR="114300" simplePos="0" relativeHeight="251661312" behindDoc="1" locked="0" layoutInCell="1" allowOverlap="1" wp14:anchorId="4479AE4F" wp14:editId="0B20D2FC">
+                  <wp:simplePos x="0" y="0"/>
+                  <wp:positionH relativeFrom="column">
+                    <wp:posOffset>5537255</wp:posOffset>
+                  </wp:positionH>
+                  <wp:positionV relativeFrom="paragraph">
+                    <wp:posOffset>2209</wp:posOffset>
+                  </wp:positionV>
                   <wp:extent cx="656811" cy="620202"/>
-                  <wp:effectExtent l="0" t="0" r="0" b="0"/>
-                  <wp:docPr id="102" name="Logo"/>
+                  <wp:effectExtent l="19050" t="0" r="0" b="0"/>
+                  <wp:wrapNone/>
+                  <wp:docPr id="35" name="Picture 14" descr="C:\Users\Administrator\Downloads\TGNewLogo.jpg"/>
                   <wp:cNvGraphicFramePr>
                     <a:graphicFrameLocks xmlns:a="http://schemas.openxmlformats.org/drawingml/2006/main" noChangeAspect="1"/>
                   </wp:cNvGraphicFramePr>
@@ -122,16 +317,19 @@
                     <a:graphicData uri="http://schemas.openxmlformats.org/drawingml/2006/picture">
                       <pic:pic xmlns:pic="http://schemas.openxmlformats.org/drawingml/2006/picture">
                         <pic:nvPicPr>
-                          <pic:cNvPr id="102" name="Logo"/>
-                          <pic:cNvPicPr/>
+                          <pic:cNvPr id="0" name="Picture 14" descr="C:\Users\Administrator\Downloads\TGNewLogo.jpg"/>
+                          <pic:cNvPicPr>
+                            <a:picLocks noChangeAspect="1" noChangeArrowheads="1"/>
+                          </pic:cNvPicPr>
                         </pic:nvPicPr>
                         <pic:blipFill>
-                          <a:blip r:embed="rId6"/>
+                          <a:blip r:embed="rId6" cstate="print"/>
+                          <a:srcRect/>
                           <a:stretch>
                             <a:fillRect/>
                           </a:stretch>
                         </pic:blipFill>
-                        <pic:spPr>
+                        <pic:spPr bwMode="auto">
                           <a:xfrm>
                             <a:off x="0" y="0"/>
                             <a:ext cx="656811" cy="620202"/>
@@ -139,11 +337,18 @@
                           <a:prstGeom prst="rect">
                             <a:avLst/>
                           </a:prstGeom>
+                          <a:noFill/>
+                          <a:ln w="9525">
+                            <a:noFill/>
+                            <a:miter lim="800000"/>
+                            <a:headEnd/>
+                            <a:tailEnd/>
+                          </a:ln>
                         </pic:spPr>
                       </pic:pic>
                     </a:graphicData>
                   </a:graphic>
-                </wp:inline>
+                </wp:anchor>
               </w:drawing>
             </w:r>
           </w:p>
@@ -222,8 +427,8 @@
           <w:b/>
           <w:bCs/>
           <w:kern w:val="0"/>
-          <w:sz w:val="28"/>
-          <w:szCs w:val="28"/>
+          <w:sz w:val="24"/>
+          <w:szCs w:val="24"/>
           <w:lang w:val="en-US"/>
           <w14:ligatures w14:val="none"/>
         </w:rPr>
@@ -235,8 +440,8 @@
           <w:i/>
           <w:iCs/>
           <w:kern w:val="0"/>
-          <w:sz w:val="28"/>
-          <w:szCs w:val="28"/>
+          <w:sz w:val="24"/>
+          <w:szCs w:val="24"/>
           <w:lang w:val="en-US"/>
           <w14:ligatures w14:val="none"/>
         </w:rPr>
@@ -253,8 +458,8 @@
           <w:i/>
           <w:iCs/>
           <w:kern w:val="0"/>
-          <w:sz w:val="28"/>
-          <w:szCs w:val="28"/>
+          <w:sz w:val="24"/>
+          <w:szCs w:val="24"/>
           <w:lang w:val="en-US"/>
           <w14:ligatures w14:val="none"/>
         </w:rPr>
@@ -266,8 +471,8 @@
           <w:i/>
           <w:iCs/>
           <w:kern w:val="0"/>
-          <w:sz w:val="28"/>
-          <w:szCs w:val="28"/>
+          <w:sz w:val="24"/>
+          <w:szCs w:val="24"/>
           <w:lang w:val="en-US"/>
           <w14:ligatures w14:val="none"/>
         </w:rPr>
@@ -280,8 +485,8 @@
           <w:i/>
           <w:iCs/>
           <w:kern w:val="0"/>
-          <w:sz w:val="28"/>
-          <w:szCs w:val="28"/>
+          <w:sz w:val="24"/>
+          <w:szCs w:val="24"/>
           <w:lang w:val="en-US"/>
           <w14:ligatures w14:val="none"/>
         </w:rPr>
@@ -294,8 +499,8 @@
           <w:i/>
           <w:iCs/>
           <w:kern w:val="0"/>
-          <w:sz w:val="28"/>
-          <w:szCs w:val="28"/>
+          <w:sz w:val="24"/>
+          <w:szCs w:val="24"/>
           <w:lang w:val="en-US"/>
           <w14:ligatures w14:val="none"/>
         </w:rPr>
@@ -308,8 +513,8 @@
           <w:i/>
           <w:iCs/>
           <w:kern w:val="0"/>
-          <w:sz w:val="28"/>
-          <w:szCs w:val="28"/>
+          <w:sz w:val="24"/>
+          <w:szCs w:val="24"/>
           <w:lang w:val="en-US"/>
           <w14:ligatures w14:val="none"/>
         </w:rPr>
@@ -322,8 +527,8 @@
           <w:i/>
           <w:iCs/>
           <w:kern w:val="0"/>
-          <w:sz w:val="28"/>
-          <w:szCs w:val="28"/>
+          <w:sz w:val="24"/>
+          <w:szCs w:val="24"/>
           <w:lang w:val="en-US"/>
           <w14:ligatures w14:val="none"/>
         </w:rPr>
@@ -336,8 +541,8 @@
           <w:i/>
           <w:iCs/>
           <w:kern w:val="0"/>
-          <w:sz w:val="28"/>
-          <w:szCs w:val="28"/>
+          <w:sz w:val="24"/>
+          <w:szCs w:val="24"/>
           <w:lang w:val="en-US"/>
           <w14:ligatures w14:val="none"/>
         </w:rPr>
@@ -350,8 +555,8 @@
           <w:i/>
           <w:iCs/>
           <w:kern w:val="0"/>
-          <w:sz w:val="28"/>
-          <w:szCs w:val="28"/>
+          <w:sz w:val="24"/>
+          <w:szCs w:val="24"/>
           <w:lang w:val="en-US"/>
           <w14:ligatures w14:val="none"/>
         </w:rPr>
@@ -364,8 +569,8 @@
           <w:i/>
           <w:iCs/>
           <w:kern w:val="0"/>
-          <w:sz w:val="28"/>
-          <w:szCs w:val="28"/>
+          <w:sz w:val="24"/>
+          <w:szCs w:val="24"/>
           <w:lang w:val="en-US"/>
           <w14:ligatures w14:val="none"/>
         </w:rPr>
@@ -383,8 +588,8 @@
           <w:i/>
           <w:iCs/>
           <w:kern w:val="0"/>
-          <w:sz w:val="28"/>
-          <w:szCs w:val="28"/>
+          <w:sz w:val="24"/>
+          <w:szCs w:val="24"/>
           <w:lang w:val="en-US"/>
           <w14:ligatures w14:val="none"/>
         </w:rPr>
@@ -396,8 +601,8 @@
           <w:i/>
           <w:iCs/>
           <w:kern w:val="0"/>
-          <w:sz w:val="28"/>
-          <w:szCs w:val="28"/>
+          <w:sz w:val="24"/>
+          <w:szCs w:val="24"/>
           <w:lang w:val="en-US"/>
           <w14:ligatures w14:val="none"/>
         </w:rPr>
@@ -411,8 +616,8 @@
           <w:i/>
           <w:iCs/>
           <w:kern w:val="0"/>
-          <w:sz w:val="28"/>
-          <w:szCs w:val="28"/>
+          <w:sz w:val="24"/>
+          <w:szCs w:val="24"/>
           <w:lang w:val="en-US"/>
           <w14:ligatures w14:val="none"/>
         </w:rPr>
@@ -425,8 +630,8 @@
           <w:i/>
           <w:iCs/>
           <w:kern w:val="0"/>
-          <w:sz w:val="28"/>
-          <w:szCs w:val="28"/>
+          <w:sz w:val="24"/>
+          <w:szCs w:val="24"/>
           <w:lang w:val="en-US"/>
           <w14:ligatures w14:val="none"/>
         </w:rPr>
@@ -439,8 +644,8 @@
           <w:i/>
           <w:iCs/>
           <w:kern w:val="0"/>
-          <w:sz w:val="28"/>
-          <w:szCs w:val="28"/>
+          <w:sz w:val="24"/>
+          <w:szCs w:val="24"/>
           <w:lang w:val="en-US"/>
           <w14:ligatures w14:val="none"/>
         </w:rPr>
@@ -457,8 +662,8 @@
           <w:i/>
           <w:iCs/>
           <w:kern w:val="0"/>
-          <w:sz w:val="28"/>
-          <w:szCs w:val="28"/>
+          <w:sz w:val="24"/>
+          <w:szCs w:val="24"/>
           <w:lang w:val="en-US"/>
           <w14:ligatures w14:val="none"/>
         </w:rPr>
@@ -470,8 +675,8 @@
           <w:i/>
           <w:iCs/>
           <w:kern w:val="0"/>
-          <w:sz w:val="28"/>
-          <w:szCs w:val="28"/>
+          <w:sz w:val="24"/>
+          <w:szCs w:val="24"/>
           <w:lang w:val="en-US"/>
           <w14:ligatures w14:val="none"/>
         </w:rPr>
@@ -484,8 +689,8 @@
           <w:i/>
           <w:iCs/>
           <w:kern w:val="0"/>
-          <w:sz w:val="28"/>
-          <w:szCs w:val="28"/>
+          <w:sz w:val="24"/>
+          <w:szCs w:val="24"/>
           <w:lang w:val="en-US"/>
           <w14:ligatures w14:val="none"/>
         </w:rPr>
@@ -513,8 +718,8 @@
           <w:i/>
           <w:iCs/>
           <w:kern w:val="0"/>
-          <w:sz w:val="28"/>
-          <w:szCs w:val="28"/>
+          <w:sz w:val="24"/>
+          <w:szCs w:val="24"/>
           <w:lang w:val="en-US"/>
           <w14:ligatures w14:val="none"/>
         </w:rPr>
@@ -527,8 +732,8 @@
           <w:i/>
           <w:iCs/>
           <w:kern w:val="0"/>
-          <w:sz w:val="28"/>
-          <w:szCs w:val="28"/>
+          <w:sz w:val="24"/>
+          <w:szCs w:val="24"/>
           <w:lang w:val="en-US"/>
           <w14:ligatures w14:val="none"/>
         </w:rPr>
@@ -541,8 +746,8 @@
           <w:i/>
           <w:iCs/>
           <w:kern w:val="0"/>
-          <w:sz w:val="28"/>
-          <w:szCs w:val="28"/>
+          <w:sz w:val="24"/>
+          <w:szCs w:val="24"/>
           <w:lang w:val="en-US"/>
           <w14:ligatures w14:val="none"/>
         </w:rPr>
@@ -555,8 +760,8 @@
           <w:i/>
           <w:iCs/>
           <w:kern w:val="0"/>
-          <w:sz w:val="28"/>
-          <w:szCs w:val="28"/>
+          <w:sz w:val="24"/>
+          <w:szCs w:val="24"/>
           <w:lang w:val="en-US"/>
           <w14:ligatures w14:val="none"/>
         </w:rPr>
@@ -569,8 +774,8 @@
           <w:i/>
           <w:iCs/>
           <w:kern w:val="0"/>
-          <w:sz w:val="28"/>
-          <w:szCs w:val="28"/>
+          <w:sz w:val="24"/>
+          <w:szCs w:val="24"/>
           <w:lang w:val="en-US"/>
           <w14:ligatures w14:val="none"/>
         </w:rPr>
@@ -583,8 +788,8 @@
           <w:i/>
           <w:iCs/>
           <w:kern w:val="0"/>
-          <w:sz w:val="28"/>
-          <w:szCs w:val="28"/>
+          <w:sz w:val="24"/>
+          <w:szCs w:val="24"/>
           <w:lang w:val="en-US"/>
           <w14:ligatures w14:val="none"/>
         </w:rPr>
@@ -597,8 +802,8 @@
           <w:i/>
           <w:iCs/>
           <w:kern w:val="0"/>
-          <w:sz w:val="28"/>
-          <w:szCs w:val="28"/>
+          <w:sz w:val="24"/>
+          <w:szCs w:val="24"/>
           <w:lang w:val="en-US"/>
           <w14:ligatures w14:val="none"/>
         </w:rPr>
@@ -611,8 +816,8 @@
           <w:i/>
           <w:iCs/>
           <w:kern w:val="0"/>
-          <w:sz w:val="28"/>
-          <w:szCs w:val="28"/>
+          <w:sz w:val="24"/>
+          <w:szCs w:val="24"/>
           <w:lang w:val="en-US"/>
           <w14:ligatures w14:val="none"/>
         </w:rPr>
@@ -626,8 +831,8 @@
           <w:i/>
           <w:iCs/>
           <w:kern w:val="0"/>
-          <w:sz w:val="28"/>
-          <w:szCs w:val="28"/>
+          <w:sz w:val="24"/>
+          <w:szCs w:val="24"/>
           <w:lang w:val="en-US"/>
           <w14:ligatures w14:val="none"/>
         </w:rPr>
@@ -2867,7 +3072,7 @@
     </w:p>
     <w:sectPr>
       <w:pgSz w:w="11906" w:h="16838"/>
-      <w:pgMar w:top="936" w:right="1440" w:bottom="1440" w:left="1440" w:header="708" w:footer="708" w:gutter="0"/>
+      <w:pgMar w:top="936" w:right="1440" w:bottom="720" w:left="1440" w:header="708" w:footer="708" w:gutter="0"/>
       <w:cols w:space="708"/>
       <w:docGrid w:linePitch="360"/>
     </w:sectPr>

</xml_diff>

<commit_message>
Release 1.17.1 — ASD on reserved works, non-responsive count, note indent, Work Order sign-off
- Intimation & Note Submitted: reserved-category work quoted >25% below now shows
  ASD (EMD is exempted for reserved works, not ASD). Robust tender-% magnitude
  parse; Note Submitted takes the L1 sheet's own quoted %.
- Note Submitted: non-responsive sheet counts every disqualified agency — line
  height read from the name column so single-line comments no longer collapse.
- Note Submitted: every paragraph opens with a first-line indent (leading em-spaces,
  since html-to-docx ignores CSS text-indent).
- Work Order: EE sign-off is a centered block on the right (Executive Engineer /
  {{Circle}} Circle-{{CNO}} / {{Corporation}}); added Corporation placeholder.

Co-Authored-By: Claude Opus 4.8 <noreply@anthropic.com>
</commit_message>
<xml_diff>
--- a/resources/work-order-template.docx
+++ b/resources/work-order-template.docx
@@ -2622,161 +2622,85 @@
     <w:p>
       <w:pPr>
         <w:spacing w:after="0" w:line="240" w:lineRule="auto"/>
-        <w:ind w:left="5040" w:firstLine="720"/>
-        <w:rPr>
-          <w:rFonts w:ascii="Times New Roman" w:eastAsia="Times New Roman" w:hAnsi="Times New Roman" w:cs="Times New Roman"/>
-          <w:b/>
-          <w:kern w:val="0"/>
-          <w:sz w:val="22"/>
-          <w:szCs w:val="22"/>
-          <w:lang w:val="en-US"/>
-          <w14:ligatures w14:val="none"/>
-        </w:rPr>
-      </w:pPr>
-      <w:r>
-        <w:rPr>
-          <w:rFonts w:ascii="Times New Roman" w:eastAsia="Times New Roman" w:hAnsi="Times New Roman" w:cs="Times New Roman"/>
-          <w:b/>
-          <w:kern w:val="0"/>
-          <w:sz w:val="22"/>
-          <w:szCs w:val="22"/>
-          <w:lang w:val="en-US"/>
-          <w14:ligatures w14:val="none"/>
-        </w:rPr>
-        <w:t xml:space="preserve">            Executive Engineer </w:t>
+        <w:ind w:left="5040"/>
+        <w:jc w:val="center"/>
+        <w:rPr>
+          <w:rFonts w:ascii="Times New Roman" w:eastAsia="Times New Roman" w:hAnsi="Times New Roman" w:cs="Times New Roman"/>
+          <w:b/>
+          <w:kern w:val="0"/>
+          <w:sz w:val="22"/>
+          <w:szCs w:val="22"/>
+          <w:lang w:val="en-US"/>
+          <w14:ligatures w14:val="none"/>
+        </w:rPr>
+      </w:pPr>
+      <w:r>
+        <w:rPr>
+          <w:rFonts w:ascii="Times New Roman" w:eastAsia="Times New Roman" w:hAnsi="Times New Roman" w:cs="Times New Roman"/>
+          <w:b/>
+          <w:kern w:val="0"/>
+          <w:sz w:val="22"/>
+          <w:szCs w:val="22"/>
+          <w:lang w:val="en-US"/>
+          <w14:ligatures w14:val="none"/>
+        </w:rPr>
+        <w:t xml:space="preserve">Executive Engineer</w:t>
       </w:r>
     </w:p>
     <w:p>
       <w:pPr>
         <w:spacing w:after="0" w:line="240" w:lineRule="auto"/>
-        <w:rPr>
-          <w:rFonts w:ascii="Times New Roman" w:eastAsia="Times New Roman" w:hAnsi="Times New Roman" w:cs="Times New Roman"/>
-          <w:kern w:val="0"/>
-          <w:sz w:val="22"/>
-          <w:szCs w:val="22"/>
-          <w:lang w:val="en-US"/>
-          <w14:ligatures w14:val="none"/>
-        </w:rPr>
-      </w:pPr>
-      <w:r>
-        <w:rPr>
-          <w:rFonts w:ascii="Times New Roman" w:eastAsia="Times New Roman" w:hAnsi="Times New Roman" w:cs="Times New Roman"/>
-          <w:b/>
-          <w:kern w:val="0"/>
-          <w:sz w:val="22"/>
-          <w:szCs w:val="22"/>
-          <w:lang w:val="en-US"/>
-          <w14:ligatures w14:val="none"/>
-        </w:rPr>
-        <w:tab/>
-      </w:r>
-      <w:r>
-        <w:rPr>
-          <w:rFonts w:ascii="Times New Roman" w:eastAsia="Times New Roman" w:hAnsi="Times New Roman" w:cs="Times New Roman"/>
-          <w:b/>
-          <w:kern w:val="0"/>
-          <w:sz w:val="22"/>
-          <w:szCs w:val="22"/>
-          <w:lang w:val="en-US"/>
-          <w14:ligatures w14:val="none"/>
-        </w:rPr>
-        <w:tab/>
-      </w:r>
-      <w:r>
-        <w:rPr>
-          <w:rFonts w:ascii="Times New Roman" w:eastAsia="Times New Roman" w:hAnsi="Times New Roman" w:cs="Times New Roman"/>
-          <w:b/>
-          <w:kern w:val="0"/>
-          <w:sz w:val="22"/>
-          <w:szCs w:val="22"/>
-          <w:lang w:val="en-US"/>
-          <w14:ligatures w14:val="none"/>
-        </w:rPr>
-        <w:tab/>
-      </w:r>
-      <w:r>
-        <w:rPr>
-          <w:rFonts w:ascii="Times New Roman" w:eastAsia="Times New Roman" w:hAnsi="Times New Roman" w:cs="Times New Roman"/>
-          <w:b/>
-          <w:kern w:val="0"/>
-          <w:sz w:val="22"/>
-          <w:szCs w:val="22"/>
-          <w:lang w:val="en-US"/>
-          <w14:ligatures w14:val="none"/>
-        </w:rPr>
-        <w:tab/>
-      </w:r>
-      <w:r>
-        <w:rPr>
-          <w:rFonts w:ascii="Times New Roman" w:eastAsia="Times New Roman" w:hAnsi="Times New Roman" w:cs="Times New Roman"/>
-          <w:b/>
-          <w:kern w:val="0"/>
-          <w:sz w:val="22"/>
-          <w:szCs w:val="22"/>
-          <w:lang w:val="en-US"/>
-          <w14:ligatures w14:val="none"/>
-        </w:rPr>
-        <w:tab/>
-      </w:r>
-      <w:r>
-        <w:rPr>
-          <w:rFonts w:ascii="Times New Roman" w:eastAsia="Times New Roman" w:hAnsi="Times New Roman" w:cs="Times New Roman"/>
-          <w:b/>
-          <w:kern w:val="0"/>
-          <w:sz w:val="22"/>
-          <w:szCs w:val="22"/>
-          <w:lang w:val="en-US"/>
-          <w14:ligatures w14:val="none"/>
-        </w:rPr>
-        <w:tab/>
-      </w:r>
-      <w:r>
-        <w:rPr>
-          <w:rFonts w:ascii="Times New Roman" w:eastAsia="Times New Roman" w:hAnsi="Times New Roman" w:cs="Times New Roman"/>
-          <w:b/>
-          <w:kern w:val="0"/>
-          <w:sz w:val="22"/>
-          <w:szCs w:val="22"/>
-          <w:lang w:val="en-US"/>
-          <w14:ligatures w14:val="none"/>
-        </w:rPr>
-        <w:tab/>
-        <w:t xml:space="preserve">              </w:t>
-      </w:r>
-      <w:r>
-        <w:rPr>
-          <w:rFonts w:ascii="Times New Roman" w:eastAsia="Times New Roman" w:hAnsi="Times New Roman" w:cs="Times New Roman"/>
-          <w:b/>
-          <w:kern w:val="0"/>
-          <w:sz w:val="22"/>
-          <w:szCs w:val="22"/>
-          <w:lang w:val="en-US"/>
-          <w14:ligatures w14:val="none"/>
-        </w:rPr>
-        <w:t>{{Circle}}</w:t>
-      </w:r>
-      <w:r>
-        <w:rPr>
-          <w:rFonts w:ascii="Times New Roman" w:eastAsia="Times New Roman" w:hAnsi="Times New Roman" w:cs="Times New Roman"/>
-          <w:b/>
-          <w:kern w:val="0"/>
-          <w:sz w:val="22"/>
-          <w:szCs w:val="22"/>
-          <w:lang w:val="en-US"/>
-          <w14:ligatures w14:val="none"/>
-        </w:rPr>
-        <w:t xml:space="preserve"> Circle, CMC</w:t>
-      </w:r>
-      <w:r>
-        <w:rPr>
-          <w:rFonts w:ascii="Times New Roman" w:eastAsia="Times New Roman" w:hAnsi="Times New Roman" w:cs="Times New Roman"/>
-          <w:kern w:val="0"/>
-          <w:sz w:val="22"/>
-          <w:szCs w:val="22"/>
-          <w:lang w:val="en-US"/>
-          <w14:ligatures w14:val="none"/>
-        </w:rPr>
-        <w:t xml:space="preserve">.    </w:t>
+        <w:ind w:left="5040"/>
+        <w:jc w:val="center"/>
+        <w:rPr>
+          <w:rFonts w:ascii="Times New Roman" w:eastAsia="Times New Roman" w:hAnsi="Times New Roman" w:cs="Times New Roman"/>
+          <w:b/>
+          <w:kern w:val="0"/>
+          <w:sz w:val="22"/>
+          <w:szCs w:val="22"/>
+          <w:lang w:val="en-US"/>
+          <w14:ligatures w14:val="none"/>
+        </w:rPr>
+      </w:pPr>
+      <w:r>
+        <w:rPr>
+          <w:rFonts w:ascii="Times New Roman" w:eastAsia="Times New Roman" w:hAnsi="Times New Roman" w:cs="Times New Roman"/>
+          <w:b/>
+          <w:kern w:val="0"/>
+          <w:sz w:val="22"/>
+          <w:szCs w:val="22"/>
+          <w:lang w:val="en-US"/>
+          <w14:ligatures w14:val="none"/>
+        </w:rPr>
+        <w:t xml:space="preserve">{{Circle}} Circle-{{CNO}}</w:t>
+      </w:r>
+    </w:p>
+    <w:p>
+      <w:pPr>
+        <w:spacing w:after="0" w:line="240" w:lineRule="auto"/>
+        <w:ind w:left="5040"/>
+        <w:jc w:val="center"/>
+        <w:rPr>
+          <w:rFonts w:ascii="Times New Roman" w:eastAsia="Times New Roman" w:hAnsi="Times New Roman" w:cs="Times New Roman"/>
+          <w:b/>
+          <w:kern w:val="0"/>
+          <w:sz w:val="22"/>
+          <w:szCs w:val="22"/>
+          <w:lang w:val="en-US"/>
+          <w14:ligatures w14:val="none"/>
+        </w:rPr>
+      </w:pPr>
+      <w:r>
+        <w:rPr>
+          <w:rFonts w:ascii="Times New Roman" w:eastAsia="Times New Roman" w:hAnsi="Times New Roman" w:cs="Times New Roman"/>
+          <w:b/>
+          <w:kern w:val="0"/>
+          <w:sz w:val="22"/>
+          <w:szCs w:val="22"/>
+          <w:lang w:val="en-US"/>
+          <w14:ligatures w14:val="none"/>
+        </w:rPr>
+        <w:t xml:space="preserve">{{Corporation}}</w:t>
       </w:r>
     </w:p>
     <w:p>

</xml_diff>